<commit_message>
Rename to Build Studio, Authorization Studio and ATO Package Builder
The Technical Training Library becomes the Build Studio and the GRC & RMF
Training Library the Authorization Studio; each page keeps "Technical
Training" or "GRC & RMF Training" under the name. The Authorization
Workspace becomes the ATO Package Builder. Addresses are unchanged.

Co-Authored-By: Claude Opus 5.5 <noreply@anthropic.com>
Claude-Session: https://claude.ai/code/session_011gqg1suY3epAZn4KnRBHYo
</commit_message>
<xml_diff>
--- a/public/grc-rmf-training/rmf/SecureByDesign-rmf-Workbook.docx
+++ b/public/grc-rmf-training/rmf/SecureByDesign-rmf-Workbook.docx
@@ -136,7 +136,7 @@
           <w:sz w:val="21"/>
           <w:szCs w:val="21"/>
         </w:rPr>
-        <w:t xml:space="preserve">Take the network the Build the Network courses (1.1–1.19) create, the system shown in Inside the Network, through all seven steps of the Risk Management Framework (RMF) to an Authorization to Operate, following NIST SP 800-37 Revision 2 with the April 2016 Joint Special Access Program Implementation Guide (JSIG) mapped in. Each step pairs its lessons with the same task in the Authorization Workspace and its templates from the ATO Template Library: prepare and categorize the system, select and implement its controls, build the Body of Evidence, assess it and plan the fixes in a POA&amp;M, assemble the package for a decision, and keep the authorization current.</w:t>
+        <w:t xml:space="preserve">Take the network the Build the Network courses (1.1–1.19) create, the system shown in Inside the Network, through all seven steps of the Risk Management Framework (RMF) to an Authorization to Operate, following NIST SP 800-37 Revision 2 with the April 2016 Joint Special Access Program Implementation Guide (JSIG) mapped in. Each step pairs its lessons with the same task in the ATO Package Builder and its templates from the ATO Template Library: prepare and categorize the system, select and implement its controls, build the Body of Evidence, assess it and plan the fixes in a POA&amp;M, assemble the package for a decision, and keep the authorization current.</w:t>
       </w:r>
     </w:p>
     <w:p>
@@ -612,7 +612,7 @@
           <w:sz w:val="21"/>
           <w:szCs w:val="21"/>
         </w:rPr>
-        <w:t xml:space="preserve">Take the network the Build the Network courses (1.1–1.19) create, the system shown in Inside the Network, through all seven steps of the Risk Management Framework (RMF) to an Authorization to Operate, following NIST SP 800-37 Revision 2 with the April 2016 Joint Special Access Program Implementation Guide (JSIG) mapped in. Each step pairs its lessons with the same task in the Authorization Workspace and its templates from the ATO Template Library: prepare and categorize the system, select and implement its controls, build the Body of Evidence, assess it and plan the fixes in a POA&amp;M, assemble the package for a decision, and keep the authorization current.</w:t>
+        <w:t xml:space="preserve">Take the network the Build the Network courses (1.1–1.19) create, the system shown in Inside the Network, through all seven steps of the Risk Management Framework (RMF) to an Authorization to Operate, following NIST SP 800-37 Revision 2 with the April 2016 Joint Special Access Program Implementation Guide (JSIG) mapped in. Each step pairs its lessons with the same task in the ATO Package Builder and its templates from the ATO Template Library: prepare and categorize the system, select and implement its controls, build the Body of Evidence, assess it and plan the fixes in a POA&amp;M, assemble the package for a decision, and keep the authorization current.</w:t>
       </w:r>
     </w:p>
     <w:p>

</xml_diff>

<commit_message>
Rename to System Hub, Configuration Hub and Compliance Hub
Inside the Network becomes the System Hub, the Build Studio the
Configuration Hub and the Authorization Studio the Compliance Hub, across
the menu, pages, course text, workbooks (Word and PDF), packages and
checklists. The ATO Package Builder keeps its name; addresses are unchanged.

Co-Authored-By: Claude Opus 5.5 <noreply@anthropic.com>
Claude-Session: https://claude.ai/code/session_011gqg1suY3epAZn4KnRBHYo
</commit_message>
<xml_diff>
--- a/public/grc-rmf-training/rmf/SecureByDesign-rmf-Workbook.docx
+++ b/public/grc-rmf-training/rmf/SecureByDesign-rmf-Workbook.docx
@@ -136,7 +136,7 @@
           <w:sz w:val="21"/>
           <w:szCs w:val="21"/>
         </w:rPr>
-        <w:t xml:space="preserve">Take the network the Build the Network courses (1.1–1.19) create, the system shown in Inside the Network, through all seven steps of the Risk Management Framework (RMF) to an Authorization to Operate, following NIST SP 800-37 Revision 2 with the April 2016 Joint Special Access Program Implementation Guide (JSIG) mapped in. Each step pairs its lessons with the same task in the ATO Package Builder and its templates from the ATO Template Library: prepare and categorize the system, select and implement its controls, build the Body of Evidence, assess it and plan the fixes in a POA&amp;M, assemble the package for a decision, and keep the authorization current.</w:t>
+        <w:t xml:space="preserve">Take the network the Build the Network courses (1.1–1.19) create, the system shown in the System Hub, through all seven steps of the Risk Management Framework (RMF) to an Authorization to Operate, following NIST SP 800-37 Revision 2 with the April 2016 Joint Special Access Program Implementation Guide (JSIG) mapped in. Each step pairs its lessons with the same task in the ATO Package Builder and its templates from the ATO Template Library: prepare and categorize the system, select and implement its controls, build the Body of Evidence, assess it and plan the fixes in a POA&amp;M, assemble the package for a decision, and keep the authorization current.</w:t>
       </w:r>
     </w:p>
     <w:p>
@@ -612,7 +612,7 @@
           <w:sz w:val="21"/>
           <w:szCs w:val="21"/>
         </w:rPr>
-        <w:t xml:space="preserve">Take the network the Build the Network courses (1.1–1.19) create, the system shown in Inside the Network, through all seven steps of the Risk Management Framework (RMF) to an Authorization to Operate, following NIST SP 800-37 Revision 2 with the April 2016 Joint Special Access Program Implementation Guide (JSIG) mapped in. Each step pairs its lessons with the same task in the ATO Package Builder and its templates from the ATO Template Library: prepare and categorize the system, select and implement its controls, build the Body of Evidence, assess it and plan the fixes in a POA&amp;M, assemble the package for a decision, and keep the authorization current.</w:t>
+        <w:t xml:space="preserve">Take the network the Build the Network courses (1.1–1.19) create, the system shown in the System Hub, through all seven steps of the Risk Management Framework (RMF) to an Authorization to Operate, following NIST SP 800-37 Revision 2 with the April 2016 Joint Special Access Program Implementation Guide (JSIG) mapped in. Each step pairs its lessons with the same task in the ATO Package Builder and its templates from the ATO Template Library: prepare and categorize the system, select and implement its controls, build the Body of Evidence, assess it and plan the fixes in a POA&amp;M, assemble the package for a decision, and keep the authorization current.</w:t>
       </w:r>
     </w:p>
     <w:p>
@@ -668,7 +668,7 @@
           <w:sz w:val="21"/>
           <w:szCs w:val="21"/>
         </w:rPr>
-        <w:t xml:space="preserve">Your Inside the Network build from Build the Network (courses 1.1–1.19), or the supplied sample records; the samples are enough to complete the course.</w:t>
+        <w:t xml:space="preserve">Your System Hub build from Build the Network (courses 1.1–1.19), or the supplied sample records; the samples are enough to complete the course.</w:t>
       </w:r>
     </w:p>
     <w:p>
@@ -743,7 +743,7 @@
           <w:sz w:val="21"/>
           <w:szCs w:val="21"/>
         </w:rPr>
-        <w:t xml:space="preserve">Prepare, categorize and select controls for the Inside the Network system, then implement them and prove each one with indexed evidence.</w:t>
+        <w:t xml:space="preserve">Prepare, categorize and select controls for the System Hub system, then implement them and prove each one with indexed evidence.</w:t>
       </w:r>
     </w:p>
     <w:p>
@@ -4694,7 +4694,7 @@
           <w:sz w:val="21"/>
           <w:szCs w:val="21"/>
         </w:rPr>
-        <w:t xml:space="preserve">Complete the scope record’s Prepare fields for the practice system: mission and stakeholders, assets and boundary, information types and life cycle, the early risk picture, and requirements and allocation. Check each information flow against the connection map in Inside the Network, which shows every permitted, pending, and denied rule for a system. Then fill in the registration record.</w:t>
+        <w:t xml:space="preserve">Complete the scope record’s Prepare fields for the practice system: mission and stakeholders, assets and boundary, information types and life cycle, the early risk picture, and requirements and allocation. Check each information flow against the connection map in the System Hub, which shows every permitted, pending, and denied rule for a system. Then fill in the registration record.</w:t>
       </w:r>
     </w:p>
     <w:p>
@@ -13186,7 +13186,7 @@
           <w:sz w:val="21"/>
           <w:szCs w:val="21"/>
         </w:rPr>
-        <w:t xml:space="preserve">Run the procedures in your approved plan and prepare a SAR excerpt. Include negative tests: run the six attempts in the Inside the Network attack drill, record each expected and observed result in the Operational verification column of the network traffic matrix, and cite the matrix in your SAR. Remediate one finding, reassess it, and update the SSP and the Risk Assessment Report (RAR) that course 2.1 drafted.</w:t>
+        <w:t xml:space="preserve">Run the procedures in your approved plan and prepare a SAR excerpt. Include negative tests: run the six attempts in the System Hub attack drill, record each expected and observed result in the Operational verification column of the network traffic matrix, and cite the matrix in your SAR. Remediate one finding, reassess it, and update the SSP and the Risk Assessment Report (RAR) that course 2.1 drafted.</w:t>
       </w:r>
     </w:p>
     <w:p>

</xml_diff>

<commit_message>
Word-only training downloads, guide notes saved to the account, plainer guide header
Owner request, 18 October 2026:
- Every tile, course page, checklist page, guide and the app offer one download: the Word workbook. ZIPs, PDFs, START-HERE, command sheets, checklist files and the 1.1 package manifest are removed, along with the scripts that built them. Old 2.2/2.3 download links redirect to the 2.1 workbook.
- Guide record Export, Readable notes and Import are gone. A signed-in learner's notes, checks, answers and completed lessons save to the account (reader_guide_state, migration 0018) and completed lessons are marked in account progress for the app. Privacy policy updated.
- Guide header links stay on the site in the same tab; the Training materials button is removed. The RMF evidence workspace no longer offers per-starter downloads.
- Course 1.1 workbook edition 0.8; RMF to ATO workbook edition 2.1.
</commit_message>
<xml_diff>
--- a/public/grc-rmf-training/rmf/SecureByDesign-rmf-Workbook.docx
+++ b/public/grc-rmf-training/rmf/SecureByDesign-rmf-Workbook.docx
@@ -150,7 +150,7 @@
           <w:sz w:val="16"/>
           <w:szCs w:val="16"/>
         </w:rPr>
-        <w:t xml:space="preserve">MATERIALS EDITION 2.0    /    COURSE 2.1</w:t>
+        <w:t xml:space="preserve">MATERIALS EDITION 2.1    /    COURSE 2.1</w:t>
       </w:r>
     </w:p>
     <w:p>
@@ -164,7 +164,7 @@
           <w:sz w:val="16"/>
           <w:szCs w:val="16"/>
         </w:rPr>
-        <w:t xml:space="preserve">Updated 15 October 2026  ·  sbd-rmf</w:t>
+        <w:t xml:space="preserve">Updated 18 October 2026  ·  sbd-rmf</w:t>
       </w:r>
     </w:p>
     <w:p>
@@ -20494,7 +20494,7 @@
           <w:sz w:val="21"/>
           <w:szCs w:val="21"/>
         </w:rPr>
-        <w:t xml:space="preserve">Blank starters for the practice artifacts this course produces. Fill them from your own system. The interactive course shows a completed fictional example of each, and the training materials download includes each one as Markdown (and CSV for tables).</w:t>
+        <w:t xml:space="preserve">Blank starters for the practice artifacts this course produces. Fill them from your own system. The interactive course shows a completed fictional example of each.</w:t>
       </w:r>
     </w:p>
     <w:p>
@@ -30962,7 +30962,7 @@
         <w:sz w:val="15"/>
         <w:szCs w:val="15"/>
       </w:rPr>
-      <w:t xml:space="preserve">© 2026 Secure By Design Team LLC.   Course 2.1 · Materials edition 2.0     </w:t>
+      <w:t xml:space="preserve">© 2026 Secure By Design Team LLC.   Course 2.1 · Materials edition 2.1     </w:t>
     </w:r>
     <w:r>
       <w:rPr>

</xml_diff>

<commit_message>
Remove the named authorization products
Owner direction, 20 October 2026: no references to the specific government and commercial
authorization systems the ATO Package Builder resembles. The builder now describes the work
the way authorization teams do it and calls itself an original practice tool, not an official
system of record. Course 2.1's text (materials edition 2.2, workbook rebuilt), the ATO Template
Library notes, the POA&M training sample, code comments, docs and AGENTS.md are reworded.
</commit_message>
<xml_diff>
--- a/public/grc-rmf-training/rmf/SecureByDesign-rmf-Workbook.docx
+++ b/public/grc-rmf-training/rmf/SecureByDesign-rmf-Workbook.docx
@@ -150,7 +150,7 @@
           <w:sz w:val="16"/>
           <w:szCs w:val="16"/>
         </w:rPr>
-        <w:t xml:space="preserve">MATERIALS EDITION 2.1    /    COURSE 2.1</w:t>
+        <w:t xml:space="preserve">MATERIALS EDITION 2.2    /    COURSE 2.1</w:t>
       </w:r>
     </w:p>
     <w:p>
@@ -164,7 +164,7 @@
           <w:sz w:val="16"/>
           <w:szCs w:val="16"/>
         </w:rPr>
-        <w:t xml:space="preserve">Updated 18 October 2026  ·  sbd-rmf</w:t>
+        <w:t xml:space="preserve">Updated 20 October 2026  ·  sbd-rmf</w:t>
       </w:r>
     </w:p>
     <w:p>
@@ -15553,7 +15553,7 @@
           <w:sz w:val="21"/>
           <w:szCs w:val="21"/>
         </w:rPr>
-        <w:t xml:space="preserve">Follow the authority’s system of record, required reviews, signatures, and submission steps. In the Enterprise Mission Assurance Support Service (eMASS) or another tool, the records still need the same substance.</w:t>
+        <w:t xml:space="preserve">Follow the authority’s system of record, required reviews, signatures, and submission steps. Whatever tool the authority uses, the records still need the same substance.</w:t>
       </w:r>
     </w:p>
     <w:p>
@@ -15794,7 +15794,7 @@
           <w:sz w:val="21"/>
           <w:szCs w:val="21"/>
         </w:rPr>
-        <w:t xml:space="preserve">Reconcile control identifiers, asset counts, findings, dates, and status across the SSP, SCTM, RAR, SAR, and POA&amp;M, and explain each difference you keep. Walk the package through a generic eMASS-style submission using training data.</w:t>
+        <w:t xml:space="preserve">Reconcile control identifiers, asset counts, findings, dates, and status across the SSP, SCTM, RAR, SAR, and POA&amp;M, and explain each difference you keep. Walk the package through a generic submission workflow using training data.</w:t>
       </w:r>
     </w:p>
     <w:p>
@@ -30962,7 +30962,7 @@
         <w:sz w:val="15"/>
         <w:szCs w:val="15"/>
       </w:rPr>
-      <w:t xml:space="preserve">© 2026 Secure By Design Team LLC.   Course 2.1 · Materials edition 2.1     </w:t>
+      <w:t xml:space="preserve">© 2026 Secure By Design Team LLC.   Course 2.1 · Materials edition 2.2     </w:t>
     </w:r>
     <w:r>
       <w:rPr>

</xml_diff>

<commit_message>
Fix course numbers the October 20 renumbering missed
Bare numbers the migration's course-reference rule skipped, in the content and
everything generated from it:
- PKI templates lesson: SBD-SPLUNK01 (1.5), SBD-WSUS01 (1.7), business services (1.11)
- PKI publication quiz: the DNS alias reserved in part 2 (was 1.2)
- Logging recap: collector (1.3), repository (1.4), analysis (1.5)
- Build the Network description: courses 1.1 to 1.12 (was 1.19)
- Course 1.1 guide, STIG findings lesson: FINDINGS TO PART 5 (was COURSE 1.5)
- Course 2.1: EPO/Nessus courses 1.9 and 1.10 (were 1.16/1.17); course 1.12 restore record (was 1.19)
- Regenerated: course 1.1 and 1.3 guides and workbooks, the course 2.1 workbook
  (also picks up its earlier 1.1-1.12 description), and the app catalog.
</commit_message>
<xml_diff>
--- a/public/grc-rmf-training/rmf/SecureByDesign-rmf-Workbook.docx
+++ b/public/grc-rmf-training/rmf/SecureByDesign-rmf-Workbook.docx
@@ -136,7 +136,7 @@
           <w:sz w:val="21"/>
           <w:szCs w:val="21"/>
         </w:rPr>
-        <w:t xml:space="preserve">Take the network the Build the Network courses (1.1–1.19) create, the system shown in the System Hub, through all seven steps of the Risk Management Framework (RMF) to an Authorization to Operate, following NIST SP 800-37 Revision 2 with the April 2016 Joint Special Access Program Implementation Guide (JSIG) mapped in. Each step pairs its lessons with the same task in the ATO Package Builder and its templates from the ATO Template Library: prepare and categorize the system, select and implement its controls, build the Body of Evidence, assess it and plan the fixes in a POA&amp;M, assemble the package for a decision, and keep the authorization current.</w:t>
+        <w:t xml:space="preserve">Take the network the Build the Network courses (1.1–1.12) create, the system shown in the System Hub, through all seven steps of the Risk Management Framework (RMF) to an Authorization to Operate, following NIST SP 800-37 Revision 2 with the April 2016 Joint Special Access Program Implementation Guide (JSIG) mapped in. Each step pairs its lessons with the same task in the ATO Package Builder and its templates from the ATO Template Library: prepare and categorize the system, select and implement its controls, build the Body of Evidence, assess it and plan the fixes in a POA&amp;M, assemble the package for a decision, and keep the authorization current.</w:t>
       </w:r>
     </w:p>
     <w:p>
@@ -612,7 +612,7 @@
           <w:sz w:val="21"/>
           <w:szCs w:val="21"/>
         </w:rPr>
-        <w:t xml:space="preserve">Take the network the Build the Network courses (1.1–1.19) create, the system shown in the System Hub, through all seven steps of the Risk Management Framework (RMF) to an Authorization to Operate, following NIST SP 800-37 Revision 2 with the April 2016 Joint Special Access Program Implementation Guide (JSIG) mapped in. Each step pairs its lessons with the same task in the ATO Package Builder and its templates from the ATO Template Library: prepare and categorize the system, select and implement its controls, build the Body of Evidence, assess it and plan the fixes in a POA&amp;M, assemble the package for a decision, and keep the authorization current.</w:t>
+        <w:t xml:space="preserve">Take the network the Build the Network courses (1.1–1.12) create, the system shown in the System Hub, through all seven steps of the Risk Management Framework (RMF) to an Authorization to Operate, following NIST SP 800-37 Revision 2 with the April 2016 Joint Special Access Program Implementation Guide (JSIG) mapped in. Each step pairs its lessons with the same task in the ATO Package Builder and its templates from the ATO Template Library: prepare and categorize the system, select and implement its controls, build the Body of Evidence, assess it and plan the fixes in a POA&amp;M, assemble the package for a decision, and keep the authorization current.</w:t>
       </w:r>
     </w:p>
     <w:p>
@@ -10487,7 +10487,7 @@
           <w:sz w:val="21"/>
           <w:szCs w:val="21"/>
         </w:rPr>
-        <w:t xml:space="preserve">Collect configuration exports, reviewed STIG checklists, SCAP Compliance Checker results with their coverage, log review records, and the course 1.19 restore record, or equivalent supplied training records. Start the master evidence index, and correct the SSP and SCTM wherever the evidence shows the system differs from the plan.</w:t>
+        <w:t xml:space="preserve">Collect configuration exports, reviewed STIG checklists, SCAP Compliance Checker results with their coverage, log review records, and the course 1.12 restore record, or equivalent supplied training records. Start the master evidence index, and correct the SSP and SCTM wherever the evidence shows the system differs from the plan.</w:t>
       </w:r>
     </w:p>
     <w:p>
@@ -11028,7 +11028,7 @@
           <w:sz w:val="20"/>
           <w:szCs w:val="20"/>
         </w:rPr>
-        <w:t xml:space="preserve">Proof comes from the systems themselves: SCAP Compliance Checker results and STIG checklists from the administration seats, log review records from SBD-SPLUNK01, and the course 1.19 restore record.</w:t>
+        <w:t xml:space="preserve">Proof comes from the systems themselves: SCAP Compliance Checker results and STIG checklists from the administration seats, log review records from SBD-SPLUNK01, and the course 1.12 restore record.</w:t>
       </w:r>
     </w:p>
     <w:p>
@@ -18660,7 +18660,7 @@
           <w:sz w:val="21"/>
           <w:szCs w:val="21"/>
         </w:rPr>
-        <w:t xml:space="preserve">New software and a changed flow: configuration (CM-6, a SCAP Compliance Checker rescan), the vendor’s update path (SI-2), its events (AU-2, AU-12), and the course 1.19 recovery set (CP-9).</w:t>
+        <w:t xml:space="preserve">New software and a changed flow: configuration (CM-6, a SCAP Compliance Checker rescan), the vendor’s update path (SI-2), its events (AU-2, AU-12), and the course 1.12 recovery set (CP-9).</w:t>
       </w:r>
     </w:p>
     <w:p>
@@ -19638,7 +19638,7 @@
           <w:sz w:val="21"/>
           <w:szCs w:val="21"/>
         </w:rPr>
-        <w:t xml:space="preserve">Use the logging trail in the Body of Evidence as the model: FND-001, SBD-MGMT01 missing from verified audit collection. Add a second finding from the rest of the scope. RA-5 is a good candidate: the SCAP Compliance Checker and Security Technical Implementation Guide (STIG) results cover configuration, but the network has no credentialed vulnerability scanning, so record that as a gap or limitation, never as a passed test. CM-6, SI-2 (SBD-WSUS01 and SBD-REPO01), and CP-9 (the course 1.19 restore record) offer others. Only the AO can accept risk (CA-6).</w:t>
+        <w:t xml:space="preserve">Use the logging trail in the Body of Evidence as the model: FND-001, SBD-MGMT01 missing from verified audit collection. Add a second finding from the rest of the scope. RA-5 is a good candidate: the SCAP Compliance Checker and Security Technical Implementation Guide (STIG) results cover configuration, but the network has no credentialed vulnerability scanning, so record that as a gap or limitation, never as a passed test. CM-6, SI-2 (SBD-WSUS01 and SBD-REPO01), and CP-9 (the course 1.12 restore record) offer others. Only the AO can accept risk (CA-6).</w:t>
       </w:r>
     </w:p>
     <w:p>

</xml_diff>